<commit_message>
Complete results with Part III, README cleanup, all PDFs regenerated
- complete_results.md: added Poinsot (7/6, 5/2, 13/2), GW predictions
  (Q=13/4, spin=cos45), CMB (r=1/169), problems 34-44, 48 total predictions
- README files renamed back to standard README.md in codes/ and visuals/
- paper/ internal README removed (main README sufficient)
- All PDFs regenerated by user
- Word docs regenerated from current md sources

Co-Authored-By: Claude Opus 4.6 (1M context) <noreply@anthropic.com>
</commit_message>
<xml_diff>
--- a/data/complete_results.docx
+++ b/data/complete_results.docx
@@ -2,7 +2,7 @@
 <file path=word/document.xml><?xml version="1.0" encoding="utf-8"?>
 <w:document xmlns:w="http://schemas.openxmlformats.org/wordprocessingml/2006/main" xmlns:m="http://schemas.openxmlformats.org/officeDocument/2006/math" xmlns:r="http://schemas.openxmlformats.org/officeDocument/2006/relationships" xmlns:o="urn:schemas-microsoft-com:office:office" xmlns:v="urn:schemas-microsoft-com:vml" xmlns:w10="urn:schemas-microsoft-com:office:word" xmlns:a="http://schemas.openxmlformats.org/drawingml/2006/main" xmlns:pic="http://schemas.openxmlformats.org/drawingml/2006/picture" xmlns:wp="http://schemas.openxmlformats.org/drawingml/2006/wordprocessingDrawing">
   <w:body>
-    <w:bookmarkStart w:id="34" w:name="complete-numerical-results"/>
+    <w:bookmarkStart w:id="40" w:name="complete-numerical-results"/>
     <w:p>
       <w:pPr>
         <w:pStyle w:val="Heading1"/>
@@ -7714,13 +7714,1412 @@
       </w:r>
     </w:p>
     <w:bookmarkEnd w:id="32"/>
-    <w:bookmarkStart w:id="33" w:name="summary-statistics"/>
+    <w:bookmarkStart w:id="38" w:name="X74b447138d4cca0b6418f39140952d8048da198"/>
     <w:p>
       <w:pPr>
         <w:pStyle w:val="Heading2"/>
       </w:pPr>
       <w:r>
-        <w:t xml:space="preserve">Summary Statistics</w:t>
+        <w:t xml:space="preserve">Part III: Poinsot Geometry and Gravitational Waves (March 22, 2026)</w:t>
+      </w:r>
+    </w:p>
+    <w:bookmarkStart w:id="33" w:name="poinsot-inertia-ratios-exact-fractions"/>
+    <w:p>
+      <w:pPr>
+        <w:pStyle w:val="Heading3"/>
+      </w:pPr>
+      <w:r>
+        <w:t xml:space="preserve">Poinsot Inertia Ratios (exact fractions)</w:t>
+      </w:r>
+    </w:p>
+    <w:tbl>
+      <w:tblPr>
+        <w:tblStyle w:val="Table"/>
+        <w:tblW w:type="auto" w:w="0"/>
+        <w:tblLook w:firstRow="1" w:lastRow="0" w:firstColumn="0" w:lastColumn="0" w:noHBand="0" w:noVBand="0" w:val="0020"/>
+      </w:tblPr>
+      <w:tblGrid>
+        <w:gridCol w:w="1584"/>
+        <w:gridCol w:w="1584"/>
+        <w:gridCol w:w="1584"/>
+        <w:gridCol w:w="1584"/>
+        <w:gridCol w:w="1584"/>
+      </w:tblGrid>
+      <w:tr>
+        <w:trPr>
+          <w:tblHeader w:val="on"/>
+        </w:trPr>
+        <w:tc>
+          <w:tcPr/>
+          <w:p>
+            <w:pPr>
+              <w:pStyle w:val="Compact"/>
+            </w:pPr>
+            <w:r>
+              <w:t xml:space="preserve">#</w:t>
+            </w:r>
+          </w:p>
+        </w:tc>
+        <w:tc>
+          <w:tcPr/>
+          <w:p>
+            <w:pPr>
+              <w:pStyle w:val="Compact"/>
+            </w:pPr>
+            <w:r>
+              <w:t xml:space="preserve">Angle</w:t>
+            </w:r>
+          </w:p>
+        </w:tc>
+        <w:tc>
+          <w:tcPr/>
+          <w:p>
+            <w:pPr>
+              <w:pStyle w:val="Compact"/>
+            </w:pPr>
+            <w:r>
+              <w:t xml:space="preserve">I1/I3</w:t>
+            </w:r>
+          </w:p>
+        </w:tc>
+        <w:tc>
+          <w:tcPr/>
+          <w:p>
+            <w:pPr>
+              <w:pStyle w:val="Compact"/>
+            </w:pPr>
+            <w:r>
+              <w:t xml:space="preserve">Exact</w:t>
+            </w:r>
+          </w:p>
+        </w:tc>
+        <w:tc>
+          <w:tcPr/>
+          <w:p>
+            <w:pPr>
+              <w:pStyle w:val="Compact"/>
+            </w:pPr>
+            <w:r>
+              <w:t xml:space="preserve">Origin</w:t>
+            </w:r>
+          </w:p>
+        </w:tc>
+      </w:tr>
+      <w:tr>
+        <w:tc>
+          <w:tcPr/>
+          <w:p>
+            <w:pPr>
+              <w:pStyle w:val="Compact"/>
+            </w:pPr>
+            <w:r>
+              <w:t xml:space="preserve">1</w:t>
+            </w:r>
+          </w:p>
+        </w:tc>
+        <w:tc>
+          <w:tcPr/>
+          <w:p>
+            <w:pPr>
+              <w:pStyle w:val="Compact"/>
+            </w:pPr>
+            <w:r>
+              <w:t xml:space="preserve">60 deg</w:t>
+            </w:r>
+          </w:p>
+        </w:tc>
+        <w:tc>
+          <w:tcPr/>
+          <w:p>
+            <w:pPr>
+              <w:pStyle w:val="Compact"/>
+            </w:pPr>
+            <w:r>
+              <w:t xml:space="preserve">1.166667</w:t>
+            </w:r>
+          </w:p>
+        </w:tc>
+        <w:tc>
+          <w:tcPr/>
+          <w:p>
+            <w:pPr>
+              <w:pStyle w:val="Compact"/>
+            </w:pPr>
+            <w:r>
+              <w:t xml:space="preserve">7/6</w:t>
+            </w:r>
+          </w:p>
+        </w:tc>
+        <w:tc>
+          <w:tcPr/>
+          <w:p>
+            <w:pPr>
+              <w:pStyle w:val="Compact"/>
+            </w:pPr>
+            <w:r>
+              <w:t xml:space="preserve">BE-shifted spherical point</w:t>
+            </w:r>
+          </w:p>
+        </w:tc>
+      </w:tr>
+      <w:tr>
+        <w:tc>
+          <w:tcPr/>
+          <w:p>
+            <w:pPr>
+              <w:pStyle w:val="Compact"/>
+            </w:pPr>
+            <w:r>
+              <w:t xml:space="preserve">2</w:t>
+            </w:r>
+          </w:p>
+        </w:tc>
+        <w:tc>
+          <w:tcPr/>
+          <w:p>
+            <w:pPr>
+              <w:pStyle w:val="Compact"/>
+            </w:pPr>
+            <w:r>
+              <w:t xml:space="preserve">45 deg</w:t>
+            </w:r>
+          </w:p>
+        </w:tc>
+        <w:tc>
+          <w:tcPr/>
+          <w:p>
+            <w:pPr>
+              <w:pStyle w:val="Compact"/>
+            </w:pPr>
+            <w:r>
+              <w:t xml:space="preserve">2.500000</w:t>
+            </w:r>
+          </w:p>
+        </w:tc>
+        <w:tc>
+          <w:tcPr/>
+          <w:p>
+            <w:pPr>
+              <w:pStyle w:val="Compact"/>
+            </w:pPr>
+            <w:r>
+              <w:t xml:space="preserve">5/2</w:t>
+            </w:r>
+          </w:p>
+        </w:tc>
+        <w:tc>
+          <w:tcPr/>
+          <w:p>
+            <w:pPr>
+              <w:pStyle w:val="Compact"/>
+            </w:pPr>
+            <w:r>
+              <w:t xml:space="preserve">Contact angle</w:t>
+            </w:r>
+          </w:p>
+        </w:tc>
+      </w:tr>
+      <w:tr>
+        <w:tc>
+          <w:tcPr/>
+          <w:p>
+            <w:pPr>
+              <w:pStyle w:val="Compact"/>
+            </w:pPr>
+            <w:r>
+              <w:t xml:space="preserve">3</w:t>
+            </w:r>
+          </w:p>
+        </w:tc>
+        <w:tc>
+          <w:tcPr/>
+          <w:p>
+            <w:pPr>
+              <w:pStyle w:val="Compact"/>
+            </w:pPr>
+            <w:r>
+              <w:t xml:space="preserve">30 deg</w:t>
+            </w:r>
+          </w:p>
+        </w:tc>
+        <w:tc>
+          <w:tcPr/>
+          <w:p>
+            <w:pPr>
+              <w:pStyle w:val="Compact"/>
+            </w:pPr>
+            <w:r>
+              <w:t xml:space="preserve">6.500000</w:t>
+            </w:r>
+          </w:p>
+        </w:tc>
+        <w:tc>
+          <w:tcPr/>
+          <w:p>
+            <w:pPr>
+              <w:pStyle w:val="Compact"/>
+            </w:pPr>
+            <w:r>
+              <w:t xml:space="preserve">13/2</w:t>
+            </w:r>
+          </w:p>
+        </w:tc>
+        <w:tc>
+          <w:tcPr/>
+          <w:p>
+            <w:pPr>
+              <w:pStyle w:val="Compact"/>
+            </w:pPr>
+            <w:r>
+              <w:t xml:space="preserve">Equilateral stabilization</w:t>
+            </w:r>
+          </w:p>
+        </w:tc>
+      </w:tr>
+    </w:tbl>
+    <w:p>
+      <w:pPr>
+        <w:pStyle w:val="BodyText"/>
+      </w:pPr>
+      <w:r>
+        <w:t xml:space="preserve">Analytic proof:</w:t>
+      </w:r>
+      <w:r>
+        <w:t xml:space="preserve"> </w:t>
+      </w:r>
+      <w:r>
+        <w:t xml:space="preserve">- 60 deg: r = h*sqrt(3), I1 = 21h^2/20, I3 = 9h^2/10, ratio = 7/6</w:t>
+      </w:r>
+      <w:r>
+        <w:t xml:space="preserve"> </w:t>
+      </w:r>
+      <w:r>
+        <w:t xml:space="preserve">- 45 deg: r = h, I1 = 3h^2/4, I3 = 3h^2/10, ratio = 5/2</w:t>
+      </w:r>
+      <w:r>
+        <w:t xml:space="preserve"> </w:t>
+      </w:r>
+      <w:r>
+        <w:t xml:space="preserve">- 30 deg: r = h/sqrt(3), I1 = 13h^2/20, I3 = h^2/10, ratio = 13/2</w:t>
+      </w:r>
+    </w:p>
+    <w:bookmarkEnd w:id="33"/>
+    <w:bookmarkStart w:id="34" w:name="braking-energetics"/>
+    <w:p>
+      <w:pPr>
+        <w:pStyle w:val="Heading3"/>
+      </w:pPr>
+      <w:r>
+        <w:t xml:space="preserve">Braking Energetics</w:t>
+      </w:r>
+    </w:p>
+    <w:tbl>
+      <w:tblPr>
+        <w:tblStyle w:val="Table"/>
+        <w:tblW w:type="pct" w:w="5000"/>
+        <w:tblLayout w:type="fixed"/>
+        <w:tblLook w:firstRow="1" w:lastRow="0" w:firstColumn="0" w:lastColumn="0" w:noHBand="0" w:noVBand="0" w:val="0020"/>
+      </w:tblPr>
+      <w:tblGrid>
+        <w:gridCol w:w="1092"/>
+        <w:gridCol w:w="2731"/>
+        <w:gridCol w:w="1911"/>
+        <w:gridCol w:w="2184"/>
+      </w:tblGrid>
+      <w:tr>
+        <w:trPr>
+          <w:tblHeader w:val="on"/>
+        </w:trPr>
+        <w:tc>
+          <w:tcPr/>
+          <w:p>
+            <w:pPr>
+              <w:pStyle w:val="Compact"/>
+            </w:pPr>
+            <w:r>
+              <w:t xml:space="preserve">#</w:t>
+            </w:r>
+          </w:p>
+        </w:tc>
+        <w:tc>
+          <w:tcPr/>
+          <w:p>
+            <w:pPr>
+              <w:pStyle w:val="Compact"/>
+            </w:pPr>
+            <w:r>
+              <w:t xml:space="preserve">Property</w:t>
+            </w:r>
+          </w:p>
+        </w:tc>
+        <w:tc>
+          <w:tcPr/>
+          <w:p>
+            <w:pPr>
+              <w:pStyle w:val="Compact"/>
+            </w:pPr>
+            <w:r>
+              <w:t xml:space="preserve">Value</w:t>
+            </w:r>
+          </w:p>
+        </w:tc>
+        <w:tc>
+          <w:tcPr/>
+          <w:p>
+            <w:pPr>
+              <w:pStyle w:val="Compact"/>
+            </w:pPr>
+            <w:r>
+              <w:t xml:space="preserve">Origin</w:t>
+            </w:r>
+          </w:p>
+        </w:tc>
+      </w:tr>
+      <w:tr>
+        <w:tc>
+          <w:tcPr/>
+          <w:p>
+            <w:pPr>
+              <w:pStyle w:val="Compact"/>
+            </w:pPr>
+            <w:r>
+              <w:t xml:space="preserve">1</w:t>
+            </w:r>
+          </w:p>
+        </w:tc>
+        <w:tc>
+          <w:tcPr/>
+          <w:p>
+            <w:pPr>
+              <w:pStyle w:val="Compact"/>
+            </w:pPr>
+            <w:r>
+              <w:t xml:space="preserve">Graviton energy</w:t>
+            </w:r>
+          </w:p>
+        </w:tc>
+        <w:tc>
+          <w:tcPr/>
+          <w:p>
+            <w:pPr>
+              <w:pStyle w:val="Compact"/>
+            </w:pPr>
+            <w:r>
+              <w:t xml:space="preserve">3.78 GeV/cone</w:t>
+            </w:r>
+          </w:p>
+        </w:tc>
+        <w:tc>
+          <w:tcPr/>
+          <w:p>
+            <w:pPr>
+              <w:pStyle w:val="Compact"/>
+            </w:pPr>
+            <w:r>
+              <w:t xml:space="preserve">delta_rho = E_grav/E_cone = 0.01512</w:t>
+            </w:r>
+          </w:p>
+        </w:tc>
+      </w:tr>
+      <w:tr>
+        <w:tc>
+          <w:tcPr/>
+          <w:p>
+            <w:pPr>
+              <w:pStyle w:val="Compact"/>
+            </w:pPr>
+            <w:r>
+              <w:t xml:space="preserve">2</w:t>
+            </w:r>
+          </w:p>
+        </w:tc>
+        <w:tc>
+          <w:tcPr/>
+          <w:p>
+            <w:pPr>
+              <w:pStyle w:val="Compact"/>
+            </w:pPr>
+            <w:r>
+              <w:t xml:space="preserve">Torsion fraction</w:t>
+            </w:r>
+          </w:p>
+        </w:tc>
+        <w:tc>
+          <w:tcPr/>
+          <w:p>
+            <w:pPr>
+              <w:pStyle w:val="Compact"/>
+            </w:pPr>
+            <w:r>
+              <w:t xml:space="preserve">linear with delta_rho</w:t>
+            </w:r>
+          </w:p>
+        </w:tc>
+        <w:tc>
+          <w:tcPr/>
+          <w:p>
+            <w:pPr>
+              <w:pStyle w:val="Compact"/>
+            </w:pPr>
+            <w:r>
+              <w:t xml:space="preserve">T_torsion/T_spin = delta_rho</w:t>
+            </w:r>
+          </w:p>
+        </w:tc>
+      </w:tr>
+      <w:tr>
+        <w:tc>
+          <w:tcPr/>
+          <w:p>
+            <w:pPr>
+              <w:pStyle w:val="Compact"/>
+            </w:pPr>
+            <w:r>
+              <w:t xml:space="preserve">3</w:t>
+            </w:r>
+          </w:p>
+        </w:tc>
+        <w:tc>
+          <w:tcPr/>
+          <w:p>
+            <w:pPr>
+              <w:pStyle w:val="Compact"/>
+            </w:pPr>
+            <w:r>
+              <w:t xml:space="preserve">Spin remaining at 30 deg</w:t>
+            </w:r>
+          </w:p>
+        </w:tc>
+        <w:tc>
+          <w:tcPr/>
+          <w:p>
+            <w:pPr>
+              <w:pStyle w:val="Compact"/>
+            </w:pPr>
+            <w:r>
+              <w:t xml:space="preserve">4.67%</w:t>
+            </w:r>
+          </w:p>
+        </w:tc>
+        <w:tc>
+          <w:tcPr/>
+          <w:p>
+            <w:pPr>
+              <w:pStyle w:val="Compact"/>
+            </w:pPr>
+            <w:r>
+              <w:t xml:space="preserve">I3(30)/I3(89)</w:t>
+            </w:r>
+          </w:p>
+        </w:tc>
+      </w:tr>
+      <w:tr>
+        <w:tc>
+          <w:tcPr/>
+          <w:p>
+            <w:pPr>
+              <w:pStyle w:val="Compact"/>
+            </w:pPr>
+            <w:r>
+              <w:t xml:space="preserve">4</w:t>
+            </w:r>
+          </w:p>
+        </w:tc>
+        <w:tc>
+          <w:tcPr/>
+          <w:p>
+            <w:pPr>
+              <w:pStyle w:val="Compact"/>
+            </w:pPr>
+            <w:r>
+              <w:t xml:space="preserve">Energy to torsion</w:t>
+            </w:r>
+          </w:p>
+        </w:tc>
+        <w:tc>
+          <w:tcPr/>
+          <w:p>
+            <w:pPr>
+              <w:pStyle w:val="Compact"/>
+            </w:pPr>
+            <w:r>
+              <w:t xml:space="preserve">95.33%</w:t>
+            </w:r>
+          </w:p>
+        </w:tc>
+        <w:tc>
+          <w:tcPr/>
+          <w:p>
+            <w:pPr>
+              <w:pStyle w:val="Compact"/>
+            </w:pPr>
+            <w:r>
+              <w:t xml:space="preserve">Braking = gravity</w:t>
+            </w:r>
+          </w:p>
+        </w:tc>
+      </w:tr>
+    </w:tbl>
+    <w:bookmarkEnd w:id="34"/>
+    <w:bookmarkStart w:id="35" w:name="gravitational-wave-predictions"/>
+    <w:p>
+      <w:pPr>
+        <w:pStyle w:val="Heading3"/>
+      </w:pPr>
+      <w:r>
+        <w:t xml:space="preserve">Gravitational Wave Predictions</w:t>
+      </w:r>
+    </w:p>
+    <w:tbl>
+      <w:tblPr>
+        <w:tblStyle w:val="Table"/>
+        <w:tblW w:type="pct" w:w="5000"/>
+        <w:tblLayout w:type="fixed"/>
+        <w:tblLook w:firstRow="1" w:lastRow="0" w:firstColumn="0" w:lastColumn="0" w:noHBand="0" w:noVBand="0" w:val="0020"/>
+      </w:tblPr>
+      <w:tblGrid>
+        <w:gridCol w:w="621"/>
+        <w:gridCol w:w="1552"/>
+        <w:gridCol w:w="1708"/>
+        <w:gridCol w:w="2950"/>
+        <w:gridCol w:w="1087"/>
+      </w:tblGrid>
+      <w:tr>
+        <w:trPr>
+          <w:tblHeader w:val="on"/>
+        </w:trPr>
+        <w:tc>
+          <w:tcPr/>
+          <w:p>
+            <w:pPr>
+              <w:pStyle w:val="Compact"/>
+            </w:pPr>
+            <w:r>
+              <w:t xml:space="preserve">#</w:t>
+            </w:r>
+          </w:p>
+        </w:tc>
+        <w:tc>
+          <w:tcPr/>
+          <w:p>
+            <w:pPr>
+              <w:pStyle w:val="Compact"/>
+            </w:pPr>
+            <w:r>
+              <w:t xml:space="preserve">Property</w:t>
+            </w:r>
+          </w:p>
+        </w:tc>
+        <w:tc>
+          <w:tcPr/>
+          <w:p>
+            <w:pPr>
+              <w:pStyle w:val="Compact"/>
+            </w:pPr>
+            <w:r>
+              <w:t xml:space="preserve">Predicted</w:t>
+            </w:r>
+          </w:p>
+        </w:tc>
+        <w:tc>
+          <w:tcPr/>
+          <w:p>
+            <w:pPr>
+              <w:pStyle w:val="Compact"/>
+            </w:pPr>
+            <w:r>
+              <w:t xml:space="preserve">Measured (GW250114)</w:t>
+            </w:r>
+          </w:p>
+        </w:tc>
+        <w:tc>
+          <w:tcPr/>
+          <w:p>
+            <w:pPr>
+              <w:pStyle w:val="Compact"/>
+            </w:pPr>
+            <w:r>
+              <w:t xml:space="preserve">Match</w:t>
+            </w:r>
+          </w:p>
+        </w:tc>
+      </w:tr>
+      <w:tr>
+        <w:tc>
+          <w:tcPr/>
+          <w:p>
+            <w:pPr>
+              <w:pStyle w:val="Compact"/>
+            </w:pPr>
+            <w:r>
+              <w:t xml:space="preserve">1</w:t>
+            </w:r>
+          </w:p>
+        </w:tc>
+        <w:tc>
+          <w:tcPr/>
+          <w:p>
+            <w:pPr>
+              <w:pStyle w:val="Compact"/>
+            </w:pPr>
+            <w:r>
+              <w:t xml:space="preserve">Q_220/Q_221</w:t>
+            </w:r>
+          </w:p>
+        </w:tc>
+        <w:tc>
+          <w:tcPr/>
+          <w:p>
+            <w:pPr>
+              <w:pStyle w:val="Compact"/>
+            </w:pPr>
+            <w:r>
+              <w:t xml:space="preserve">13/4 = 3.250</w:t>
+            </w:r>
+          </w:p>
+        </w:tc>
+        <w:tc>
+          <w:tcPr/>
+          <w:p>
+            <w:pPr>
+              <w:pStyle w:val="Compact"/>
+            </w:pPr>
+            <w:r>
+              <w:t xml:space="preserve">3.231</w:t>
+            </w:r>
+          </w:p>
+        </w:tc>
+        <w:tc>
+          <w:tcPr/>
+          <w:p>
+            <w:pPr>
+              <w:pStyle w:val="Compact"/>
+            </w:pPr>
+            <w:r>
+              <w:t xml:space="preserve">99.4%</w:t>
+            </w:r>
+          </w:p>
+        </w:tc>
+      </w:tr>
+      <w:tr>
+        <w:tc>
+          <w:tcPr/>
+          <w:p>
+            <w:pPr>
+              <w:pStyle w:val="Compact"/>
+            </w:pPr>
+            <w:r>
+              <w:t xml:space="preserve">2</w:t>
+            </w:r>
+          </w:p>
+        </w:tc>
+        <w:tc>
+          <w:tcPr/>
+          <w:p>
+            <w:pPr>
+              <w:pStyle w:val="Compact"/>
+            </w:pPr>
+            <w:r>
+              <w:t xml:space="preserve">Final spin (q~1)</w:t>
+            </w:r>
+          </w:p>
+        </w:tc>
+        <w:tc>
+          <w:tcPr/>
+          <w:p>
+            <w:pPr>
+              <w:pStyle w:val="Compact"/>
+            </w:pPr>
+            <w:r>
+              <w:t xml:space="preserve">cos(45) = 0.707</w:t>
+            </w:r>
+          </w:p>
+        </w:tc>
+        <w:tc>
+          <w:tcPr/>
+          <w:p>
+            <w:pPr>
+              <w:pStyle w:val="Compact"/>
+            </w:pPr>
+            <w:r>
+              <w:t xml:space="preserve">0.69</w:t>
+            </w:r>
+          </w:p>
+        </w:tc>
+        <w:tc>
+          <w:tcPr/>
+          <w:p>
+            <w:pPr>
+              <w:pStyle w:val="Compact"/>
+            </w:pPr>
+            <w:r>
+              <w:t xml:space="preserve">97.6%</w:t>
+            </w:r>
+          </w:p>
+        </w:tc>
+      </w:tr>
+      <w:tr>
+        <w:tc>
+          <w:tcPr/>
+          <w:p>
+            <w:pPr>
+              <w:pStyle w:val="Compact"/>
+            </w:pPr>
+            <w:r>
+              <w:t xml:space="preserve">3</w:t>
+            </w:r>
+          </w:p>
+        </w:tc>
+        <w:tc>
+          <w:tcPr/>
+          <w:p>
+            <w:pPr>
+              <w:pStyle w:val="Compact"/>
+            </w:pPr>
+            <w:r>
+              <w:t xml:space="preserve">f_220</w:t>
+            </w:r>
+          </w:p>
+        </w:tc>
+        <w:tc>
+          <w:tcPr/>
+          <w:p>
+            <w:pPr>
+              <w:pStyle w:val="Compact"/>
+            </w:pPr>
+            <w:r>
+              <w:t xml:space="preserve">14558/M Hz</w:t>
+            </w:r>
+          </w:p>
+        </w:tc>
+        <w:tc>
+          <w:tcPr/>
+          <w:p>
+            <w:pPr>
+              <w:pStyle w:val="Compact"/>
+            </w:pPr>
+            <w:r>
+              <w:t xml:space="preserve">251 Hz (M=58)</w:t>
+            </w:r>
+          </w:p>
+        </w:tc>
+        <w:tc>
+          <w:tcPr/>
+          <w:p>
+            <w:pPr>
+              <w:pStyle w:val="Compact"/>
+            </w:pPr>
+            <w:r>
+              <w:t xml:space="preserve">100%</w:t>
+            </w:r>
+          </w:p>
+        </w:tc>
+      </w:tr>
+      <w:tr>
+        <w:tc>
+          <w:tcPr/>
+          <w:p>
+            <w:pPr>
+              <w:pStyle w:val="Compact"/>
+            </w:pPr>
+            <w:r>
+              <w:t xml:space="preserve">4</w:t>
+            </w:r>
+          </w:p>
+        </w:tc>
+        <w:tc>
+          <w:tcPr/>
+          <w:p>
+            <w:pPr>
+              <w:pStyle w:val="Compact"/>
+            </w:pPr>
+            <w:r>
+              <w:t xml:space="preserve">Spin formula</w:t>
+            </w:r>
+          </w:p>
+        </w:tc>
+        <w:tc>
+          <w:tcPr/>
+          <w:p>
+            <w:pPr>
+              <w:pStyle w:val="Compact"/>
+            </w:pPr>
+            <w:r>
+              <w:t xml:space="preserve">cos(45)*4q/(1+q)^2</w:t>
+            </w:r>
+          </w:p>
+        </w:tc>
+        <w:tc>
+          <w:tcPr/>
+          <w:p>
+            <w:pPr>
+              <w:pStyle w:val="Compact"/>
+            </w:pPr>
+            <w:r>
+              <w:t xml:space="preserve">-</w:t>
+            </w:r>
+          </w:p>
+        </w:tc>
+        <w:tc>
+          <w:tcPr/>
+          <w:p>
+            <w:pPr>
+              <w:pStyle w:val="Compact"/>
+            </w:pPr>
+            <w:r>
+              <w:t xml:space="preserve">structural</w:t>
+            </w:r>
+          </w:p>
+        </w:tc>
+      </w:tr>
+      <w:tr>
+        <w:tc>
+          <w:tcPr/>
+          <w:p>
+            <w:pPr>
+              <w:pStyle w:val="Compact"/>
+            </w:pPr>
+            <w:r>
+              <w:t xml:space="preserve">5</w:t>
+            </w:r>
+          </w:p>
+        </w:tc>
+        <w:tc>
+          <w:tcPr/>
+          <w:p>
+            <w:pPr>
+              <w:pStyle w:val="Compact"/>
+            </w:pPr>
+            <w:r>
+              <w:t xml:space="preserve">Q ratio universality</w:t>
+            </w:r>
+          </w:p>
+        </w:tc>
+        <w:tc>
+          <w:tcPr/>
+          <w:p>
+            <w:pPr>
+              <w:pStyle w:val="Compact"/>
+            </w:pPr>
+            <w:r>
+              <w:t xml:space="preserve">constant for ALL events</w:t>
+            </w:r>
+          </w:p>
+        </w:tc>
+        <w:tc>
+          <w:tcPr/>
+          <w:p>
+            <w:pPr>
+              <w:pStyle w:val="Compact"/>
+            </w:pPr>
+            <w:r>
+              <w:t xml:space="preserve">-</w:t>
+            </w:r>
+          </w:p>
+        </w:tc>
+        <w:tc>
+          <w:tcPr/>
+          <w:p>
+            <w:pPr>
+              <w:pStyle w:val="Compact"/>
+            </w:pPr>
+            <w:r>
+              <w:t xml:space="preserve">testable IR1</w:t>
+            </w:r>
+          </w:p>
+        </w:tc>
+      </w:tr>
+    </w:tbl>
+    <w:p>
+      <w:pPr>
+        <w:pStyle w:val="BodyText"/>
+      </w:pPr>
+      <w:r>
+        <w:t xml:space="preserve">GW250114 retrodict: Jan 14, 2025, 08:22:03.200 UTC. Critical window: 3 ms.</w:t>
+      </w:r>
+    </w:p>
+    <w:bookmarkEnd w:id="35"/>
+    <w:bookmarkStart w:id="36" w:name="cmb-polarization"/>
+    <w:p>
+      <w:pPr>
+        <w:pStyle w:val="Heading3"/>
+      </w:pPr>
+      <w:r>
+        <w:t xml:space="preserve">CMB Polarization</w:t>
+      </w:r>
+    </w:p>
+    <w:tbl>
+      <w:tblPr>
+        <w:tblStyle w:val="Table"/>
+        <w:tblW w:type="pct" w:w="5000"/>
+        <w:tblLayout w:type="fixed"/>
+        <w:tblLook w:firstRow="1" w:lastRow="0" w:firstColumn="0" w:lastColumn="0" w:noHBand="0" w:noVBand="0" w:val="0020"/>
+      </w:tblPr>
+      <w:tblGrid>
+        <w:gridCol w:w="1092"/>
+        <w:gridCol w:w="2731"/>
+        <w:gridCol w:w="1911"/>
+        <w:gridCol w:w="2184"/>
+      </w:tblGrid>
+      <w:tr>
+        <w:trPr>
+          <w:tblHeader w:val="on"/>
+        </w:trPr>
+        <w:tc>
+          <w:tcPr/>
+          <w:p>
+            <w:pPr>
+              <w:pStyle w:val="Compact"/>
+            </w:pPr>
+            <w:r>
+              <w:t xml:space="preserve">#</w:t>
+            </w:r>
+          </w:p>
+        </w:tc>
+        <w:tc>
+          <w:tcPr/>
+          <w:p>
+            <w:pPr>
+              <w:pStyle w:val="Compact"/>
+            </w:pPr>
+            <w:r>
+              <w:t xml:space="preserve">Property</w:t>
+            </w:r>
+          </w:p>
+        </w:tc>
+        <w:tc>
+          <w:tcPr/>
+          <w:p>
+            <w:pPr>
+              <w:pStyle w:val="Compact"/>
+            </w:pPr>
+            <w:r>
+              <w:t xml:space="preserve">Value</w:t>
+            </w:r>
+          </w:p>
+        </w:tc>
+        <w:tc>
+          <w:tcPr/>
+          <w:p>
+            <w:pPr>
+              <w:pStyle w:val="Compact"/>
+            </w:pPr>
+            <w:r>
+              <w:t xml:space="preserve">Origin</w:t>
+            </w:r>
+          </w:p>
+        </w:tc>
+      </w:tr>
+      <w:tr>
+        <w:tc>
+          <w:tcPr/>
+          <w:p>
+            <w:pPr>
+              <w:pStyle w:val="Compact"/>
+            </w:pPr>
+            <w:r>
+              <w:t xml:space="preserve">1</w:t>
+            </w:r>
+          </w:p>
+        </w:tc>
+        <w:tc>
+          <w:tcPr/>
+          <w:p>
+            <w:pPr>
+              <w:pStyle w:val="Compact"/>
+            </w:pPr>
+            <w:r>
+              <w:t xml:space="preserve">Tensor-to-scalar r</w:t>
+            </w:r>
+          </w:p>
+        </w:tc>
+        <w:tc>
+          <w:tcPr/>
+          <w:p>
+            <w:pPr>
+              <w:pStyle w:val="Compact"/>
+            </w:pPr>
+            <w:r>
+              <w:t xml:space="preserve">1/169 = 1/13^2 = 0.00592</w:t>
+            </w:r>
+          </w:p>
+        </w:tc>
+        <w:tc>
+          <w:tcPr/>
+          <w:p>
+            <w:pPr>
+              <w:pStyle w:val="Compact"/>
+            </w:pPr>
+            <w:r>
+              <w:t xml:space="preserve">sin</w:t>
+            </w:r>
+            <w:r>
+              <w:rPr>
+                <w:vertAlign w:val="superscript"/>
+              </w:rPr>
+              <w:t xml:space="preserve">2(30)*(I3/I1)</w:t>
+            </w:r>
+            <w:r>
+              <w:t xml:space="preserve">2</w:t>
+            </w:r>
+          </w:p>
+        </w:tc>
+      </w:tr>
+      <w:tr>
+        <w:tc>
+          <w:tcPr/>
+          <w:p>
+            <w:pPr>
+              <w:pStyle w:val="Compact"/>
+            </w:pPr>
+            <w:r>
+              <w:t xml:space="preserve">2</w:t>
+            </w:r>
+          </w:p>
+        </w:tc>
+        <w:tc>
+          <w:tcPr/>
+          <w:p>
+            <w:pPr>
+              <w:pStyle w:val="Compact"/>
+            </w:pPr>
+            <w:r>
+              <w:t xml:space="preserve">r epoch-dependence</w:t>
+            </w:r>
+          </w:p>
+        </w:tc>
+        <w:tc>
+          <w:tcPr/>
+          <w:p>
+            <w:pPr>
+              <w:pStyle w:val="Compact"/>
+            </w:pPr>
+            <w:r>
+              <w:t xml:space="preserve">r(sigma) = (1/169)</w:t>
+            </w:r>
+            <w:r>
+              <w:rPr>
+                <w:i/>
+                <w:iCs/>
+              </w:rPr>
+              <w:t xml:space="preserve">exp(pi - 2</w:t>
+            </w:r>
+            <w:r>
+              <w:t xml:space="preserve">arctan(sigma))</w:t>
+            </w:r>
+          </w:p>
+        </w:tc>
+        <w:tc>
+          <w:tcPr/>
+          <w:p>
+            <w:pPr>
+              <w:pStyle w:val="Compact"/>
+            </w:pPr>
+            <w:r>
+              <w:t xml:space="preserve">c1/c2 modulation</w:t>
+            </w:r>
+          </w:p>
+        </w:tc>
+      </w:tr>
+      <w:tr>
+        <w:tc>
+          <w:tcPr/>
+          <w:p>
+            <w:pPr>
+              <w:pStyle w:val="Compact"/>
+            </w:pPr>
+            <w:r>
+              <w:t xml:space="preserve">3</w:t>
+            </w:r>
+          </w:p>
+        </w:tc>
+        <w:tc>
+          <w:tcPr/>
+          <w:p>
+            <w:pPr>
+              <w:pStyle w:val="Compact"/>
+            </w:pPr>
+            <w:r>
+              <w:t xml:space="preserve">r at CMB (z~1100)</w:t>
+            </w:r>
+          </w:p>
+        </w:tc>
+        <w:tc>
+          <w:tcPr/>
+          <w:p>
+            <w:pPr>
+              <w:pStyle w:val="Compact"/>
+            </w:pPr>
+            <w:r>
+              <w:t xml:space="preserve">~0.134</w:t>
+            </w:r>
+          </w:p>
+        </w:tc>
+        <w:tc>
+          <w:tcPr/>
+          <w:p>
+            <w:pPr>
+              <w:pStyle w:val="Compact"/>
+            </w:pPr>
+            <w:r>
+              <w:t xml:space="preserve">early universe, large B-mode</w:t>
+            </w:r>
+          </w:p>
+        </w:tc>
+      </w:tr>
+      <w:tr>
+        <w:tc>
+          <w:tcPr/>
+          <w:p>
+            <w:pPr>
+              <w:pStyle w:val="Compact"/>
+            </w:pPr>
+            <w:r>
+              <w:t xml:space="preserve">4</w:t>
+            </w:r>
+          </w:p>
+        </w:tc>
+        <w:tc>
+          <w:tcPr/>
+          <w:p>
+            <w:pPr>
+              <w:pStyle w:val="Compact"/>
+            </w:pPr>
+            <w:r>
+              <w:t xml:space="preserve">r now (asymptotic)</w:t>
+            </w:r>
+          </w:p>
+        </w:tc>
+        <w:tc>
+          <w:tcPr/>
+          <w:p>
+            <w:pPr>
+              <w:pStyle w:val="Compact"/>
+            </w:pPr>
+            <w:r>
+              <w:t xml:space="preserve">0.006</w:t>
+            </w:r>
+          </w:p>
+        </w:tc>
+        <w:tc>
+          <w:tcPr/>
+          <w:p>
+            <w:pPr>
+              <w:pStyle w:val="Compact"/>
+            </w:pPr>
+            <w:r>
+              <w:t xml:space="preserve">late universe</w:t>
+            </w:r>
+          </w:p>
+        </w:tc>
+      </w:tr>
+      <w:tr>
+        <w:tc>
+          <w:tcPr/>
+          <w:p>
+            <w:pPr>
+              <w:pStyle w:val="Compact"/>
+            </w:pPr>
+            <w:r>
+              <w:t xml:space="preserve">5</w:t>
+            </w:r>
+          </w:p>
+        </w:tc>
+        <w:tc>
+          <w:tcPr/>
+          <w:p>
+            <w:pPr>
+              <w:pStyle w:val="Compact"/>
+            </w:pPr>
+            <w:r>
+              <w:t xml:space="preserve">Quadrupole suppression</w:t>
+            </w:r>
+          </w:p>
+        </w:tc>
+        <w:tc>
+          <w:tcPr/>
+          <w:p>
+            <w:pPr>
+              <w:pStyle w:val="Compact"/>
+            </w:pPr>
+            <w:r>
+              <w:t xml:space="preserve">~83%</w:t>
+            </w:r>
+          </w:p>
+        </w:tc>
+        <w:tc>
+          <w:tcPr/>
+          <w:p>
+            <w:pPr>
+              <w:pStyle w:val="Compact"/>
+            </w:pPr>
+            <w:r>
+              <w:t xml:space="preserve">counter-rotation cancellation</w:t>
+            </w:r>
+          </w:p>
+        </w:tc>
+      </w:tr>
+      <w:tr>
+        <w:tc>
+          <w:tcPr/>
+          <w:p>
+            <w:pPr>
+              <w:pStyle w:val="Compact"/>
+            </w:pPr>
+            <w:r>
+              <w:t xml:space="preserve">6</w:t>
+            </w:r>
+          </w:p>
+        </w:tc>
+        <w:tc>
+          <w:tcPr/>
+          <w:p>
+            <w:pPr>
+              <w:pStyle w:val="Compact"/>
+            </w:pPr>
+            <w:r>
+              <w:t xml:space="preserve">B/E amplitude</w:t>
+            </w:r>
+          </w:p>
+        </w:tc>
+        <w:tc>
+          <w:tcPr/>
+          <w:p>
+            <w:pPr>
+              <w:pStyle w:val="Compact"/>
+            </w:pPr>
+            <w:r>
+              <w:t xml:space="preserve">1/13</w:t>
+            </w:r>
+          </w:p>
+        </w:tc>
+        <w:tc>
+          <w:tcPr/>
+          <w:p>
+            <w:pPr>
+              <w:pStyle w:val="Compact"/>
+            </w:pPr>
+            <w:r>
+              <w:t xml:space="preserve">sin(30)*(I3/I1)</w:t>
+            </w:r>
+          </w:p>
+        </w:tc>
+      </w:tr>
+      <w:tr>
+        <w:tc>
+          <w:tcPr/>
+          <w:p>
+            <w:pPr>
+              <w:pStyle w:val="Compact"/>
+            </w:pPr>
+            <w:r>
+              <w:t xml:space="preserve">7</w:t>
+            </w:r>
+          </w:p>
+        </w:tc>
+        <w:tc>
+          <w:tcPr/>
+          <w:p>
+            <w:pPr>
+              <w:pStyle w:val="Compact"/>
+            </w:pPr>
+            <w:r>
+              <w:t xml:space="preserve">GW amplitude ceiling</w:t>
+            </w:r>
+          </w:p>
+        </w:tc>
+        <w:tc>
+          <w:tcPr/>
+          <w:p>
+            <w:pPr>
+              <w:pStyle w:val="Compact"/>
+            </w:pPr>
+            <w:r>
+              <w:t xml:space="preserve">sin(30)*sin(pi/13) = 0.120</w:t>
+            </w:r>
+          </w:p>
+        </w:tc>
+        <w:tc>
+          <w:tcPr/>
+          <w:p>
+            <w:pPr>
+              <w:pStyle w:val="Compact"/>
+            </w:pPr>
+            <w:r>
+              <w:t xml:space="preserve">phi capped at pi/2</w:t>
+            </w:r>
+          </w:p>
+        </w:tc>
+      </w:tr>
+      <w:tr>
+        <w:tc>
+          <w:tcPr/>
+          <w:p>
+            <w:pPr>
+              <w:pStyle w:val="Compact"/>
+            </w:pPr>
+            <w:r>
+              <w:t xml:space="preserve">8</w:t>
+            </w:r>
+          </w:p>
+        </w:tc>
+        <w:tc>
+          <w:tcPr/>
+          <w:p>
+            <w:pPr>
+              <w:pStyle w:val="Compact"/>
+            </w:pPr>
+            <w:r>
+              <w:t xml:space="preserve">GW angular window</w:t>
+            </w:r>
+          </w:p>
+        </w:tc>
+        <w:tc>
+          <w:tcPr/>
+          <w:p>
+            <w:pPr>
+              <w:pStyle w:val="Compact"/>
+            </w:pPr>
+            <w:r>
+              <w:t xml:space="preserve">pi/13 = 13.85 deg</w:t>
+            </w:r>
+          </w:p>
+        </w:tc>
+        <w:tc>
+          <w:tcPr/>
+          <w:p>
+            <w:pPr>
+              <w:pStyle w:val="Compact"/>
+            </w:pPr>
+            <w:r>
+              <w:t xml:space="preserve">precessional envelope</w:t>
+            </w:r>
+          </w:p>
+        </w:tc>
+      </w:tr>
+    </w:tbl>
+    <w:p>
+      <w:pPr>
+        <w:pStyle w:val="BodyText"/>
+      </w:pPr>
+      <w:r>
+        <w:t xml:space="preserve">BICEP/Keck 2021 limit: r &lt; 0.036. Framework r = 0.006 consistent.</w:t>
+      </w:r>
+      <w:r>
+        <w:t xml:space="preserve"> </w:t>
+      </w:r>
+      <w:r>
+        <w:t xml:space="preserve">LiteBIRD (~2032) sensitivity r ~ 0.001: will detect or exclude.</w:t>
+      </w:r>
+    </w:p>
+    <w:bookmarkEnd w:id="36"/>
+    <w:bookmarkStart w:id="37" w:name="problems-resolved-in-part-iii-34-44"/>
+    <w:p>
+      <w:pPr>
+        <w:pStyle w:val="Heading3"/>
+      </w:pPr>
+      <w:r>
+        <w:t xml:space="preserve">Problems Resolved in Part III (34-44)</w:t>
       </w:r>
     </w:p>
     <w:p>
@@ -7732,7 +9131,7 @@
         </w:numPr>
       </w:pPr>
       <w:r>
-        <w:t xml:space="preserve">Total numerical predictions: 32 (17 Part I + 15 Part II)</w:t>
+        <w:t xml:space="preserve">Causality in (2,3) — constraint prevents CTC, sigma monotone</w:t>
       </w:r>
     </w:p>
     <w:p>
@@ -7744,7 +9143,7 @@
         </w:numPr>
       </w:pPr>
       <w:r>
-        <w:t xml:space="preserve">Matches above 99%: 15</w:t>
+        <w:t xml:space="preserve">Poinsot duality — classical mechanics and quantum mass emergence are same geometry</w:t>
       </w:r>
     </w:p>
     <w:p>
@@ -7756,7 +9155,7 @@
         </w:numPr>
       </w:pPr>
       <w:r>
-        <w:t xml:space="preserve">Matches above 98%: 25</w:t>
+        <w:t xml:space="preserve">Irreversibility — birth requires local entropy decrease</w:t>
       </w:r>
     </w:p>
     <w:p>
@@ -7768,7 +9167,7 @@
         </w:numPr>
       </w:pPr>
       <w:r>
-        <w:t xml:space="preserve">Exact matches: 4 (theta_23, delta_CP, Koide, dark_e = muon)</w:t>
+        <w:t xml:space="preserve">Symmetry breaking — occurs in entropy, not in space</w:t>
       </w:r>
     </w:p>
     <w:p>
@@ -7780,7 +9179,7 @@
         </w:numPr>
       </w:pPr>
       <w:r>
-        <w:t xml:space="preserve">Proven identities: 2 (CP bosonic, theta_QCD)</w:t>
+        <w:t xml:space="preserve">Gravity origin — braking energy of counter-rotation frozen as torsion</w:t>
       </w:r>
     </w:p>
     <w:p>
@@ -7792,7 +9191,7 @@
         </w:numPr>
       </w:pPr>
       <w:r>
-        <w:t xml:space="preserve">Structural derivations: 7 (Maxwell x4, Schrodinger, 3 generations, gravity universality)</w:t>
+        <w:t xml:space="preserve">SMBH — precession snapshots, not accreted objects</w:t>
       </w:r>
     </w:p>
     <w:p>
@@ -7804,7 +9203,7 @@
         </w:numPr>
       </w:pPr>
       <w:r>
-        <w:t xml:space="preserve">Average match: 99.4%</w:t>
+        <w:t xml:space="preserve">CMB quadrupole suppression — counter-rotation cancellation</w:t>
       </w:r>
     </w:p>
     <w:p>
@@ -7816,7 +9215,7 @@
         </w:numPr>
       </w:pPr>
       <w:r>
-        <w:t xml:space="preserve">Problems resolved: 33+</w:t>
+        <w:t xml:space="preserve">B-mode amplitude — sin(30) torsion fraction</w:t>
       </w:r>
     </w:p>
     <w:p>
@@ -7828,7 +9227,7 @@
         </w:numPr>
       </w:pPr>
       <w:r>
-        <w:t xml:space="preserve">Free parameters: 0 (beyond F2 axiom)</w:t>
+        <w:t xml:space="preserve">Tensor-to-scalar r = 1/13^2 — testable prediction</w:t>
       </w:r>
     </w:p>
     <w:p>
@@ -7840,17 +9239,7 @@
         </w:numPr>
       </w:pPr>
       <w:r>
-        <w:t xml:space="preserve">Measured inputs: 0 (N derived from N</w:t>
-      </w:r>
-      <w:r>
-        <w:rPr>
-          <w:i/>
-          <w:iCs/>
-        </w:rPr>
-        <w:t xml:space="preserve">Delta = 254, Delta = 4</w:t>
-      </w:r>
-      <w:r>
-        <w:t xml:space="preserve">alpha^2/9)</w:t>
+        <w:t xml:space="preserve">r epoch-dependence — unique to framework, no other model predicts this</w:t>
       </w:r>
     </w:p>
     <w:p>
@@ -7862,6 +9251,166 @@
         </w:numPr>
       </w:pPr>
       <w:r>
+        <w:t xml:space="preserve">M-sigma relation — exponent 4 from (I3/I1)^2 at equilateral</w:t>
+      </w:r>
+    </w:p>
+    <w:p>
+      <w:r>
+        <w:pict>
+          <v:rect style="width:0;height:1.5pt" o:hralign="center" o:hrstd="t" o:hr="t"/>
+        </w:pict>
+      </w:r>
+    </w:p>
+    <w:bookmarkEnd w:id="37"/>
+    <w:bookmarkEnd w:id="38"/>
+    <w:bookmarkStart w:id="39" w:name="summary-statistics"/>
+    <w:p>
+      <w:pPr>
+        <w:pStyle w:val="Heading2"/>
+      </w:pPr>
+      <w:r>
+        <w:t xml:space="preserve">Summary Statistics</w:t>
+      </w:r>
+    </w:p>
+    <w:p>
+      <w:pPr>
+        <w:pStyle w:val="Compact"/>
+        <w:numPr>
+          <w:ilvl w:val="0"/>
+          <w:numId w:val="1004"/>
+        </w:numPr>
+      </w:pPr>
+      <w:r>
+        <w:t xml:space="preserve">Total numerical predictions: 48 (17 Part I + 15 Part II + 16 Part III)</w:t>
+      </w:r>
+    </w:p>
+    <w:p>
+      <w:pPr>
+        <w:pStyle w:val="Compact"/>
+        <w:numPr>
+          <w:ilvl w:val="0"/>
+          <w:numId w:val="1004"/>
+        </w:numPr>
+      </w:pPr>
+      <w:r>
+        <w:t xml:space="preserve">Matches above 99%: 18</w:t>
+      </w:r>
+    </w:p>
+    <w:p>
+      <w:pPr>
+        <w:pStyle w:val="Compact"/>
+        <w:numPr>
+          <w:ilvl w:val="0"/>
+          <w:numId w:val="1004"/>
+        </w:numPr>
+      </w:pPr>
+      <w:r>
+        <w:t xml:space="preserve">Matches above 98%: 30</w:t>
+      </w:r>
+    </w:p>
+    <w:p>
+      <w:pPr>
+        <w:pStyle w:val="Compact"/>
+        <w:numPr>
+          <w:ilvl w:val="0"/>
+          <w:numId w:val="1004"/>
+        </w:numPr>
+      </w:pPr>
+      <w:r>
+        <w:t xml:space="preserve">Exact matches: 5 (theta_23, delta_CP, Koide, dark_e = muon, f_220)</w:t>
+      </w:r>
+    </w:p>
+    <w:p>
+      <w:pPr>
+        <w:pStyle w:val="Compact"/>
+        <w:numPr>
+          <w:ilvl w:val="0"/>
+          <w:numId w:val="1004"/>
+        </w:numPr>
+      </w:pPr>
+      <w:r>
+        <w:t xml:space="preserve">Proven identities: 2 (CP bosonic, theta_QCD)</w:t>
+      </w:r>
+    </w:p>
+    <w:p>
+      <w:pPr>
+        <w:pStyle w:val="Compact"/>
+        <w:numPr>
+          <w:ilvl w:val="0"/>
+          <w:numId w:val="1004"/>
+        </w:numPr>
+      </w:pPr>
+      <w:r>
+        <w:t xml:space="preserve">Structural derivations: 12 (Maxwell x4, Schrodinger, 3 generations, gravity universality, Poinsot x3, GW Q ratio, M-sigma)</w:t>
+      </w:r>
+    </w:p>
+    <w:p>
+      <w:pPr>
+        <w:pStyle w:val="Compact"/>
+        <w:numPr>
+          <w:ilvl w:val="0"/>
+          <w:numId w:val="1004"/>
+        </w:numPr>
+      </w:pPr>
+      <w:r>
+        <w:t xml:space="preserve">Average match: 99.3%</w:t>
+      </w:r>
+    </w:p>
+    <w:p>
+      <w:pPr>
+        <w:pStyle w:val="Compact"/>
+        <w:numPr>
+          <w:ilvl w:val="0"/>
+          <w:numId w:val="1004"/>
+        </w:numPr>
+      </w:pPr>
+      <w:r>
+        <w:t xml:space="preserve">Problems resolved: 44+</w:t>
+      </w:r>
+    </w:p>
+    <w:p>
+      <w:pPr>
+        <w:pStyle w:val="Compact"/>
+        <w:numPr>
+          <w:ilvl w:val="0"/>
+          <w:numId w:val="1004"/>
+        </w:numPr>
+      </w:pPr>
+      <w:r>
+        <w:t xml:space="preserve">Free parameters: 0 (beyond F2 axiom)</w:t>
+      </w:r>
+    </w:p>
+    <w:p>
+      <w:pPr>
+        <w:pStyle w:val="Compact"/>
+        <w:numPr>
+          <w:ilvl w:val="0"/>
+          <w:numId w:val="1004"/>
+        </w:numPr>
+      </w:pPr>
+      <w:r>
+        <w:t xml:space="preserve">Measured inputs: 0 (N derived from N</w:t>
+      </w:r>
+      <w:r>
+        <w:rPr>
+          <w:i/>
+          <w:iCs/>
+        </w:rPr>
+        <w:t xml:space="preserve">Delta = 254, Delta = 4</w:t>
+      </w:r>
+      <w:r>
+        <w:t xml:space="preserve">alpha^2/9)</w:t>
+      </w:r>
+    </w:p>
+    <w:p>
+      <w:pPr>
+        <w:pStyle w:val="Compact"/>
+        <w:numPr>
+          <w:ilvl w:val="0"/>
+          <w:numId w:val="1004"/>
+        </w:numPr>
+      </w:pPr>
+      <w:r>
         <w:t xml:space="preserve">m_e, m_mu used as cross-check (confirm N to 98.8%), not as inputs</w:t>
       </w:r>
     </w:p>
@@ -7890,8 +9439,8 @@
         <w:t xml:space="preserve">Szőke Barna</w:t>
       </w:r>
     </w:p>
-    <w:bookmarkEnd w:id="33"/>
-    <w:bookmarkEnd w:id="34"/>
+    <w:bookmarkEnd w:id="39"/>
+    <w:bookmarkEnd w:id="40"/>
     <w:sectPr>
       <w:footnotePr>
         <w:numRestart w:val="eachSect"/>
@@ -8105,6 +9654,91 @@
       </w:rPr>
     </w:lvl>
   </w:abstractNum>
+  <w:abstractNum w:abstractNumId="994134">
+    <w:nsid w:val="0A994134"/>
+    <w:multiLevelType w:val="multilevel"/>
+    <w:lvl w:ilvl="0">
+      <w:start w:val="34"/>
+      <w:numFmt w:val="decimal"/>
+      <w:lvlText w:val="%1."/>
+      <w:lvlJc w:val="left"/>
+      <w:pPr>
+        <w:ind w:left="720" w:hanging="360"/>
+      </w:pPr>
+    </w:lvl>
+    <w:lvl w:ilvl="1">
+      <w:start w:val="34"/>
+      <w:numFmt w:val="decimal"/>
+      <w:lvlText w:val="%2."/>
+      <w:lvlJc w:val="left"/>
+      <w:pPr>
+        <w:ind w:left="1440" w:hanging="360"/>
+      </w:pPr>
+    </w:lvl>
+    <w:lvl w:ilvl="2">
+      <w:start w:val="34"/>
+      <w:numFmt w:val="decimal"/>
+      <w:lvlText w:val="%3."/>
+      <w:lvlJc w:val="left"/>
+      <w:pPr>
+        <w:ind w:left="2160" w:hanging="360"/>
+      </w:pPr>
+    </w:lvl>
+    <w:lvl w:ilvl="3">
+      <w:start w:val="34"/>
+      <w:numFmt w:val="decimal"/>
+      <w:lvlText w:val="%4."/>
+      <w:lvlJc w:val="left"/>
+      <w:pPr>
+        <w:ind w:left="2880" w:hanging="360"/>
+      </w:pPr>
+    </w:lvl>
+    <w:lvl w:ilvl="4">
+      <w:start w:val="34"/>
+      <w:numFmt w:val="decimal"/>
+      <w:lvlText w:val="%5."/>
+      <w:lvlJc w:val="left"/>
+      <w:pPr>
+        <w:ind w:left="3600" w:hanging="360"/>
+      </w:pPr>
+    </w:lvl>
+    <w:lvl w:ilvl="5">
+      <w:start w:val="34"/>
+      <w:numFmt w:val="decimal"/>
+      <w:lvlText w:val="%6."/>
+      <w:lvlJc w:val="left"/>
+      <w:pPr>
+        <w:ind w:left="4320" w:hanging="360"/>
+      </w:pPr>
+    </w:lvl>
+    <w:lvl w:ilvl="6">
+      <w:start w:val="34"/>
+      <w:numFmt w:val="decimal"/>
+      <w:lvlText w:val="%7."/>
+      <w:lvlJc w:val="left"/>
+      <w:pPr>
+        <w:ind w:left="5040" w:hanging="360"/>
+      </w:pPr>
+    </w:lvl>
+    <w:lvl w:ilvl="7">
+      <w:start w:val="34"/>
+      <w:numFmt w:val="decimal"/>
+      <w:lvlText w:val="%8."/>
+      <w:lvlJc w:val="left"/>
+      <w:pPr>
+        <w:ind w:left="5760" w:hanging="360"/>
+      </w:pPr>
+    </w:lvl>
+    <w:lvl w:ilvl="8">
+      <w:start w:val="34"/>
+      <w:numFmt w:val="decimal"/>
+      <w:lvlText w:val="%9."/>
+      <w:lvlJc w:val="left"/>
+      <w:pPr>
+        <w:ind w:left="6480" w:hanging="360"/>
+      </w:pPr>
+    </w:lvl>
+  </w:abstractNum>
   <w:num w:numId="1000">
     <w:abstractNumId w:val="990"/>
   </w:num>
@@ -8115,6 +9749,36 @@
     <w:abstractNumId w:val="991"/>
   </w:num>
   <w:num w:numId="1003">
+    <w:abstractNumId w:val="994134"/>
+    <w:lvlOverride w:ilvl="0">
+      <w:startOverride w:val="34"/>
+    </w:lvlOverride>
+    <w:lvlOverride w:ilvl="1">
+      <w:startOverride w:val="34"/>
+    </w:lvlOverride>
+    <w:lvlOverride w:ilvl="2">
+      <w:startOverride w:val="34"/>
+    </w:lvlOverride>
+    <w:lvlOverride w:ilvl="3">
+      <w:startOverride w:val="34"/>
+    </w:lvlOverride>
+    <w:lvlOverride w:ilvl="4">
+      <w:startOverride w:val="34"/>
+    </w:lvlOverride>
+    <w:lvlOverride w:ilvl="5">
+      <w:startOverride w:val="34"/>
+    </w:lvlOverride>
+    <w:lvlOverride w:ilvl="6">
+      <w:startOverride w:val="34"/>
+    </w:lvlOverride>
+    <w:lvlOverride w:ilvl="7">
+      <w:startOverride w:val="34"/>
+    </w:lvlOverride>
+    <w:lvlOverride w:ilvl="8">
+      <w:startOverride w:val="34"/>
+    </w:lvlOverride>
+  </w:num>
+  <w:num w:numId="1004">
     <w:abstractNumId w:val="991"/>
   </w:num>
 </w:numbering>

</xml_diff>